<commit_message>
Update README and add screenshots
</commit_message>
<xml_diff>
--- a/Software_Design_Document.docx
+++ b/Software_Design_Document.docx
@@ -2238,6 +2238,12 @@
     <w:sectPr>
       <w:pgSz w:w="12240" w:h="15840"/>
       <w:pgMar w:top="1440" w:right="1800" w:bottom="1440" w:left="1800" w:header="720" w:footer="720" w:gutter="0"/>
+      <w:pgBorders w:offsetFrom="page">
+        <w:top w:val="single" w:sz="12" w:space="24" w:color="auto"/>
+        <w:left w:val="single" w:sz="12" w:space="24" w:color="auto"/>
+        <w:bottom w:val="single" w:sz="12" w:space="24" w:color="auto"/>
+        <w:right w:val="single" w:sz="12" w:space="24" w:color="auto"/>
+      </w:pgBorders>
       <w:cols w:space="720"/>
       <w:docGrid w:linePitch="360"/>
     </w:sectPr>

</xml_diff>